<commit_message>
Prepare the 8 November legal version
The terms, privacy policy and DPA need to allow what is being built:
a licence to reuse the questions prepza generates in a shared question
bank (with an opt-out per interview), anonymised question quality
patterns, Langfuse as a sub-processor for records of AI calls, and
prices shown in local currency. Folding the scheduled 29 October and
1 November versions into one 8 November version means one notice to
users and companies instead of two.

The new text is translated into every language, the downloadable DPA
and DPIA template follow it, and the production steps say when to
send the notices and switch Langfuse and the patterns job on.

Co-Authored-By: Claude Opus 5.5 <noreply@anthropic.com>
</commit_message>
<xml_diff>
--- a/frontend/public/documents/prepza-dpia-template.docx
+++ b/frontend/public/documents/prepza-dpia-template.docx
@@ -16,7 +16,7 @@
         <w:pStyle w:val="FirstParagraph"/>
       </w:pPr>
       <w:r>
-        <w:t xml:space="preserve">Version: 2026-11-01</w:t>
+        <w:t xml:space="preserve">Version: 2026-11-08</w:t>
       </w:r>
       <w:r>
         <w:br/>
@@ -968,19 +968,7 @@
         </w:numPr>
       </w:pPr>
       <w:r>
-        <w:t xml:space="preserve">Cloudflare (the</w:t>
-      </w:r>
-      <w:r>
-        <w:t xml:space="preserve"> </w:t>
-      </w:r>
-      <w:r>
-        <w:t xml:space="preserve">“I’m not a robot”</w:t>
-      </w:r>
-      <w:r>
-        <w:t xml:space="preserve"> </w:t>
-      </w:r>
-      <w:r>
-        <w:t xml:space="preserve">check, Turnstile, when a candidate starts through a job ad’s link: their browser’s signals and address, from which prepza keeps only whether it passed; Cloudflare, Inc., United States, under the EU-US Data Privacy Framework).</w:t>
+        <w:t xml:space="preserve">Langfuse (records of AI calls, to monitor and improve the quality of answers: what is sent to the AI and its answers, which can include candidates’ data the AI handles, such as the results the assistant reads to answer a member, and votes on the assistant’s answers; kept 30 days; Langfuse GmbH, Germany, its EU cloud).</w:t>
       </w:r>
     </w:p>
     <w:p>
@@ -992,7 +980,19 @@
         </w:numPr>
       </w:pPr>
       <w:r>
-        <w:t xml:space="preserve">Upstash (short-lived counters for limits and live updates; EU, Belgium).</w:t>
+        <w:t xml:space="preserve">Cloudflare (the</w:t>
+      </w:r>
+      <w:r>
+        <w:t xml:space="preserve"> </w:t>
+      </w:r>
+      <w:r>
+        <w:t xml:space="preserve">“I’m not a robot”</w:t>
+      </w:r>
+      <w:r>
+        <w:t xml:space="preserve"> </w:t>
+      </w:r>
+      <w:r>
+        <w:t xml:space="preserve">check, Turnstile, when a candidate starts through a job ad’s link: their browser’s signals and address, from which prepza keeps only whether it passed; Cloudflare, Inc., United States, under the EU-US Data Privacy Framework).</w:t>
       </w:r>
     </w:p>
     <w:p>
@@ -1004,6 +1004,18 @@
         </w:numPr>
       </w:pPr>
       <w:r>
+        <w:t xml:space="preserve">Upstash (short-lived counters for limits and live updates; EU, Belgium).</w:t>
+      </w:r>
+    </w:p>
+    <w:p>
+      <w:pPr>
+        <w:pStyle w:val="Compact"/>
+        <w:numPr>
+          <w:ilvl w:val="0"/>
+          <w:numId w:val="1002"/>
+        </w:numPr>
+      </w:pPr>
+      <w:r>
         <w:t xml:space="preserve">Paddle (payments; receives no candidate data).</w:t>
       </w:r>
     </w:p>
@@ -1262,6 +1274,12 @@
       </w:r>
       <w:r>
         <w:t xml:space="preserve">company is deleted.</w:t>
+      </w:r>
+      <w:r>
+        <w:t xml:space="preserve"> </w:t>
+      </w:r>
+      <w:r>
+        <w:t xml:space="preserve">Records of AI calls at Langfuse: 30 days.</w:t>
       </w:r>
       <w:r>
         <w:t xml:space="preserve"> </w:t>

</xml_diff>

<commit_message>
List all US sub-processors in the DPIA template
The DPIA template said two sub-processors handle data in the United
States, but the privacy policy names three: Cloudflare's "I'm not a
robot" check runs in the US as well. A company filling in its DPIA
from the template would have missed that transfer.

Co-Authored-By: Claude Opus 5.5 <noreply@anthropic.com>
</commit_message>
<xml_diff>
--- a/frontend/public/documents/prepza-dpia-template.docx
+++ b/frontend/public/documents/prepza-dpia-template.docx
@@ -1201,19 +1201,37 @@
         <w:t xml:space="preserve"> </w:t>
       </w:r>
       <w:r>
-        <w:t xml:space="preserve">Two sub-processors handle data in the United States: Google</w:t>
-      </w:r>
-      <w:r>
-        <w:t xml:space="preserve"> </w:t>
-      </w:r>
-      <w:r>
-        <w:t xml:space="preserve">Firebase (sign-in), under the EU-US Data Privacy Framework, and OpenAI, through OpenAI Ireland Ltd</w:t>
-      </w:r>
-      <w:r>
-        <w:t xml:space="preserve"> </w:t>
-      </w:r>
-      <w:r>
-        <w:t xml:space="preserve">under the European Commission’s standard contractual clauses. prepza gives a copy of the</w:t>
+        <w:t xml:space="preserve">Three sub-processors handle data in the United States: Google</w:t>
+      </w:r>
+      <w:r>
+        <w:t xml:space="preserve"> </w:t>
+      </w:r>
+      <w:r>
+        <w:t xml:space="preserve">Firebase (sign-in) and Cloudflare (the</w:t>
+      </w:r>
+      <w:r>
+        <w:t xml:space="preserve"> </w:t>
+      </w:r>
+      <w:r>
+        <w:t xml:space="preserve">“I’m not a robot”</w:t>
+      </w:r>
+      <w:r>
+        <w:t xml:space="preserve"> </w:t>
+      </w:r>
+      <w:r>
+        <w:t xml:space="preserve">check), under the EU-US Data Privacy</w:t>
+      </w:r>
+      <w:r>
+        <w:t xml:space="preserve"> </w:t>
+      </w:r>
+      <w:r>
+        <w:t xml:space="preserve">Framework, and OpenAI, through OpenAI Ireland Ltd under the European Commission’s standard</w:t>
+      </w:r>
+      <w:r>
+        <w:t xml:space="preserve"> </w:t>
+      </w:r>
+      <w:r>
+        <w:t xml:space="preserve">contractual clauses. prepza gives a copy of the</w:t>
       </w:r>
       <w:r>
         <w:t xml:space="preserve"> </w:t>

</xml_diff>

<commit_message>
List the pledge time in the DPA and DPIA template
The pledge time is candidate data prepza processes for companies, so
the data processing agreement and the DPIA template list it beside the
other interview data, as the privacy policy does. The DPA's 2026-11-08
version isn't in force yet, so it changes in place in every language,
with its downloadable PDF and the template's Word file rebuilt; the
versions in force stay as they were.

Co-Authored-By: Claude Opus 5.5 <noreply@anthropic.com>
</commit_message>
<xml_diff>
--- a/frontend/public/documents/prepza-dpia-template.docx
+++ b/frontend/public/documents/prepza-dpia-template.docx
@@ -685,6 +685,30 @@
             </w:pPr>
             <w:r>
               <w:t xml:space="preserve">Times the candidate left the page, copy attempts, answers under 3 seconds, each with the question on screen</w:t>
+            </w:r>
+          </w:p>
+        </w:tc>
+      </w:tr>
+      <w:tr>
+        <w:tc>
+          <w:tcPr/>
+          <w:p>
+            <w:pPr>
+              <w:pStyle w:val="Compact"/>
+            </w:pPr>
+            <w:r>
+              <w:t xml:space="preserve">Pledge</w:t>
+            </w:r>
+          </w:p>
+        </w:tc>
+        <w:tc>
+          <w:tcPr/>
+          <w:p>
+            <w:pPr>
+              <w:pStyle w:val="Compact"/>
+            </w:pPr>
+            <w:r>
+              <w:t xml:space="preserve">When the candidate confirmed, before starting, that they’d answer on their own, without AI tools or other people</w:t>
             </w:r>
           </w:p>
         </w:tc>

</xml_diff>